<commit_message>
FIX: Espacio entre portada e indice y secciones
</commit_message>
<xml_diff>
--- a/Informe_Biblioteca.docx
+++ b/Informe_Biblioteca.docx
@@ -131,7 +131,62 @@
         <w:t>008D</w:t>
       </w:r>
     </w:p>
+    <w:p>
+      <w:pPr>
+        <w:pStyle w:val="Heading1"/>
+        <w:pageBreakBefore/>
+        <w:jc w:val="center"/>
+      </w:pPr>
+      <w:r>
+        <w:rPr>
+          <w:rFonts w:ascii="Arial" w:hAnsi="Arial" w:eastAsia="Arial"/>
+          <w:b/>
+          <w:color w:val="000000"/>
+          <w:sz w:val="32"/>
+        </w:rPr>
+        <w:t>Índice</w:t>
+      </w:r>
+    </w:p>
+    <w:p>
+      <w:r>
+        <w:fldChar w:fldCharType="begin"/>
+        <w:instrText xml:space="preserve">TOC \o "1-3" \h \z \u</w:instrText>
+        <w:fldChar w:fldCharType="separate"/>
+        <w:fldChar w:fldCharType="end"/>
+      </w:r>
+    </w:p>
+    <w:p>
+      <w:pPr>
+        <w:pStyle w:val="Heading1"/>
+        <w:pageBreakBefore/>
+      </w:pPr>
+      <w:r>
+        <w:rPr>
+          <w:rFonts w:ascii="Arial" w:hAnsi="Arial" w:eastAsia="Arial"/>
+          <w:b/>
+          <w:color w:val="000000"/>
+          <w:sz w:val="32"/>
+        </w:rPr>
+        <w:t>1. SASD</w:t>
+      </w:r>
+    </w:p>
+    <w:p>
+      <w:pPr>
+        <w:pStyle w:val="Heading1"/>
+        <w:pageBreakBefore/>
+      </w:pPr>
+      <w:r>
+        <w:rPr>
+          <w:rFonts w:ascii="Arial" w:hAnsi="Arial" w:eastAsia="Arial"/>
+          <w:b/>
+          <w:color w:val="000000"/>
+          <w:sz w:val="32"/>
+        </w:rPr>
+        <w:t>2. ASDA</w:t>
+      </w:r>
+    </w:p>
     <w:sectPr>
+      <w:headerReference w:type="default" r:id="rId9"/>
       <w:pgSz w:w="12240" w:h="15840"/>
       <w:pgMar w:top="1440" w:right="1800" w:bottom="1440" w:left="1800" w:header="720" w:footer="720" w:gutter="0"/>
       <w:cols w:space="720"/>
@@ -139,6 +194,53 @@
     </w:sectPr>
   </w:body>
 </w:document>
+</file>
+
+<file path=word/header1.xml><?xml version="1.0" encoding="utf-8"?>
+<w:hdr xmlns:m="http://schemas.openxmlformats.org/officeDocument/2006/math" xmlns:mc="http://schemas.openxmlformats.org/markup-compatibility/2006" xmlns:mo="http://schemas.microsoft.com/office/mac/office/2008/main" xmlns:mv="urn:schemas-microsoft-com:mac:vml" xmlns:o="urn:schemas-microsoft-com:office:office" xmlns:r="http://schemas.openxmlformats.org/officeDocument/2006/relationships" xmlns:v="urn:schemas-microsoft-com:vml" xmlns:w10="urn:schemas-microsoft-com:office:word" xmlns:w14="http://schemas.microsoft.com/office/word/2010/wordml" xmlns:w="http://schemas.openxmlformats.org/wordprocessingml/2006/main" xmlns:wne="http://schemas.microsoft.com/office/word/2006/wordml" xmlns:wp14="http://schemas.microsoft.com/office/word/2010/wordprocessingDrawing" xmlns:wp="http://schemas.openxmlformats.org/drawingml/2006/wordprocessingDrawing" xmlns:wpc="http://schemas.microsoft.com/office/word/2010/wordprocessingCanvas" xmlns:wpg="http://schemas.microsoft.com/office/word/2010/wordprocessingGroup" xmlns:wpi="http://schemas.microsoft.com/office/word/2010/wordprocessingInk" xmlns:wps="http://schemas.microsoft.com/office/word/2010/wordprocessingShape" mc:Ignorable="w14 wp14">
+  <w:p>
+    <w:pPr>
+      <w:pStyle w:val="Header"/>
+      <w:spacing w:before="0" w:after="0"/>
+      <w:ind w:left="0"/>
+      <w:jc w:val="left"/>
+    </w:pPr>
+    <w:r>
+      <w:drawing>
+        <wp:inline xmlns:a="http://schemas.openxmlformats.org/drawingml/2006/main" xmlns:pic="http://schemas.openxmlformats.org/drawingml/2006/picture">
+          <wp:extent cx="2688336" cy="672084"/>
+          <wp:docPr id="1" name="Picture 1"/>
+          <wp:cNvGraphicFramePr>
+            <a:graphicFrameLocks noChangeAspect="1"/>
+          </wp:cNvGraphicFramePr>
+          <a:graphic>
+            <a:graphicData uri="http://schemas.openxmlformats.org/drawingml/2006/picture">
+              <pic:pic>
+                <pic:nvPicPr>
+                  <pic:cNvPr id="0" name="EncabezadoDuoc.jpg"/>
+                  <pic:cNvPicPr/>
+                </pic:nvPicPr>
+                <pic:blipFill>
+                  <a:blip r:embed="rId1"/>
+                  <a:stretch>
+                    <a:fillRect/>
+                  </a:stretch>
+                </pic:blipFill>
+                <pic:spPr>
+                  <a:xfrm>
+                    <a:off x="0" y="0"/>
+                    <a:ext cx="2688336" cy="672084"/>
+                  </a:xfrm>
+                  <a:prstGeom prst="rect"/>
+                </pic:spPr>
+              </pic:pic>
+            </a:graphicData>
+          </a:graphic>
+        </wp:inline>
+      </w:drawing>
+    </w:r>
+  </w:p>
+</w:hdr>
 </file>
 
 <file path=word/numbering.xml><?xml version="1.0" encoding="utf-8"?>
@@ -12186,6 +12288,38 @@
         <w:shd w:val="clear" w:color="auto" w:fill="FBCAA2" w:themeFill="accent6" w:themeFillTint="7F"/>
       </w:tcPr>
     </w:tblStylePr>
+  </w:style>
+  <w:style w:type="paragraph" w:customStyle="1" w:styleId="TOC1">
+    <w:name w:val="TOC 1"/>
+    <w:rPr>
+      <w:rFonts w:ascii="Arial" w:hAnsi="Arial" w:eastAsia="Arial"/>
+      <w:color w:val="000000"/>
+      <w:u w:val="none"/>
+    </w:rPr>
+  </w:style>
+  <w:style w:type="paragraph" w:customStyle="1" w:styleId="TOC2">
+    <w:name w:val="TOC 2"/>
+    <w:rPr>
+      <w:rFonts w:ascii="Arial" w:hAnsi="Arial" w:eastAsia="Arial"/>
+      <w:color w:val="000000"/>
+      <w:u w:val="none"/>
+    </w:rPr>
+  </w:style>
+  <w:style w:type="paragraph" w:customStyle="1" w:styleId="TOC3">
+    <w:name w:val="TOC 3"/>
+    <w:rPr>
+      <w:rFonts w:ascii="Arial" w:hAnsi="Arial" w:eastAsia="Arial"/>
+      <w:color w:val="000000"/>
+      <w:u w:val="none"/>
+    </w:rPr>
+  </w:style>
+  <w:style w:type="character" w:customStyle="1" w:styleId="Hyperlink">
+    <w:name w:val="Hyperlink"/>
+    <w:rPr>
+      <w:rFonts w:ascii="Arial" w:hAnsi="Arial" w:eastAsia="Arial"/>
+      <w:color w:val="000000"/>
+      <w:u w:val="none"/>
+    </w:rPr>
   </w:style>
 </w:styles>
 </file>

</xml_diff>

<commit_message>
FEAT: Apretar enter para añadir nueva seccion
</commit_message>
<xml_diff>
--- a/Informe_Biblioteca.docx
+++ b/Informe_Biblioteca.docx
@@ -149,6 +149,9 @@
     </w:p>
     <w:p>
       <w:r>
+        <w:rPr>
+          <w:rFonts w:ascii="Arial" w:hAnsi="Arial" w:eastAsia="Arial"/>
+        </w:rPr>
         <w:fldChar w:fldCharType="begin"/>
         <w:instrText xml:space="preserve">TOC \o "1-3" \h \z \u</w:instrText>
         <w:fldChar w:fldCharType="separate"/>
@@ -167,7 +170,7 @@
           <w:color w:val="000000"/>
           <w:sz w:val="32"/>
         </w:rPr>
-        <w:t>1. SASD</w:t>
+        <w:t>1. Introduccion</w:t>
       </w:r>
     </w:p>
     <w:p>
@@ -182,7 +185,22 @@
           <w:color w:val="000000"/>
           <w:sz w:val="32"/>
         </w:rPr>
-        <w:t>2. ASDA</w:t>
+        <w:t>2. Nueva seccion</w:t>
+      </w:r>
+    </w:p>
+    <w:p>
+      <w:pPr>
+        <w:pStyle w:val="Heading1"/>
+        <w:pageBreakBefore/>
+      </w:pPr>
+      <w:r>
+        <w:rPr>
+          <w:rFonts w:ascii="Arial" w:hAnsi="Arial" w:eastAsia="Arial"/>
+          <w:b/>
+          <w:color w:val="000000"/>
+          <w:sz w:val="32"/>
+        </w:rPr>
+        <w:t>3. Renacer</w:t>
       </w:r>
     </w:p>
     <w:sectPr>

</xml_diff>